<commit_message>
Sync to upstream it-28 (SHA: 5deb5e5144d5cf35ea7b68c04b73728932530255)
</commit_message>
<xml_diff>
--- a/BaseApp/Source/Base Application/Inventory/Reports/InventoryCustomerSales.docx
+++ b/BaseApp/Source/Base Application/Inventory/Reports/InventoryCustomerSales.docx
@@ -42,7 +42,7 @@
             <w:placeholder>
               <w:docPart w:val="DefaultPlaceholder_-1854013440"/>
             </w:placeholder>
-            <w:dataBinding w:prefixMappings="xmlns:ns0='urn:microsoft-dynamics-nav/reports/FS_YSD_InventoryCustomerSales/50019/' " w:xpath="/ns0:NavWordReportXmlPart[1]/ns0:Labels[1]/ns0:CustomerNoLbl[1]" w:storeItemID="{0E62280E-706F-45D7-BEE2-B24E4BE14C14}"/>
+            <w:dataBinding w:prefixMappings="xmlns:ns0='urn:microsoft-dynamics-nav/reports/Inventory_Customer_Sales/713/'" w:xpath="/ns0:NavWordReportXmlPart[1]/ns0:Labels[1]/ns0:CustomerNoLbl[1]" w:storeItemID="{0E62280E-706F-45D7-BEE2-B24E4BE14C14}"/>
             <w:text/>
             <w:alias w:val="#Nav: /Labels/CustomerNoLbl"/>
             <w:tag w:val="#Nav: FS_YSD_InventoryCustomerSales/50019"/>
@@ -88,7 +88,7 @@
             <w:placeholder>
               <w:docPart w:val="DefaultPlaceholder_-1854013440"/>
             </w:placeholder>
-            <w:dataBinding w:prefixMappings="xmlns:ns0='urn:microsoft-dynamics-nav/reports/FS_YSD_InventoryCustomerSales/50019/' " w:xpath="/ns0:NavWordReportXmlPart[1]/ns0:Labels[1]/ns0:CustNameLbl[1]" w:storeItemID="{0E62280E-706F-45D7-BEE2-B24E4BE14C14}"/>
+            <w:dataBinding w:prefixMappings="xmlns:ns0='urn:microsoft-dynamics-nav/reports/Inventory_Customer_Sales/713/'" w:xpath="/ns0:NavWordReportXmlPart[1]/ns0:Labels[1]/ns0:CustNameLbl[1]" w:storeItemID="{0E62280E-706F-45D7-BEE2-B24E4BE14C14}"/>
             <w:text/>
             <w:alias w:val="#Nav: /Labels/CustNameLbl"/>
             <w:tag w:val="#Nav: FS_YSD_InventoryCustomerSales/50019"/>
@@ -158,7 +158,7 @@
               <w:placeholder>
                 <w:docPart w:val="DefaultPlaceholder_-1854013440"/>
               </w:placeholder>
-              <w:dataBinding w:prefixMappings="xmlns:ns0='urn:microsoft-dynamics-nav/reports/FS_YSD_InventoryCustomerSales/50019/' " w:xpath="/ns0:NavWordReportXmlPart[1]/ns0:Labels[1]/ns0:InvQtyLbl[1]" w:storeItemID="{0E62280E-706F-45D7-BEE2-B24E4BE14C14}"/>
+              <w:dataBinding w:prefixMappings="xmlns:ns0='urn:microsoft-dynamics-nav/reports/Inventory_Customer_Sales/713/'" w:xpath="/ns0:NavWordReportXmlPart[1]/ns0:Labels[1]/ns0:InvQtyLbl[1]" w:storeItemID="{0E62280E-706F-45D7-BEE2-B24E4BE14C14}"/>
               <w:text/>
               <w:alias w:val="#Nav: /Labels/InvQtyLbl"/>
               <w:tag w:val="#Nav: FS_YSD_InventoryCustomerSales/50019"/>
@@ -212,7 +212,7 @@
             <w:placeholder>
               <w:docPart w:val="DefaultPlaceholder_-1854013440"/>
             </w:placeholder>
-            <w:dataBinding w:prefixMappings="xmlns:ns0='urn:microsoft-dynamics-nav/reports/FS_YSD_InventoryCustomerSales/50019/' " w:xpath="/ns0:NavWordReportXmlPart[1]/ns0:Labels[1]/ns0:AmountLbl[1]" w:storeItemID="{0E62280E-706F-45D7-BEE2-B24E4BE14C14}"/>
+            <w:dataBinding w:prefixMappings="xmlns:ns0='urn:microsoft-dynamics-nav/reports/Inventory_Customer_Sales/713/'" w:xpath="/ns0:NavWordReportXmlPart[1]/ns0:Labels[1]/ns0:AmountLbl[1]" w:storeItemID="{0E62280E-706F-45D7-BEE2-B24E4BE14C14}"/>
             <w:text/>
             <w:alias w:val="#Nav: /Labels/AmountLbl"/>
             <w:tag w:val="#Nav: FS_YSD_InventoryCustomerSales/50019"/>
@@ -269,7 +269,7 @@
               <w:placeholder>
                 <w:docPart w:val="DefaultPlaceholder_-1854013440"/>
               </w:placeholder>
-              <w:dataBinding w:prefixMappings="xmlns:ns0='urn:microsoft-dynamics-nav/reports/FS_YSD_InventoryCustomerSales/50019/' " w:xpath="/ns0:NavWordReportXmlPart[1]/ns0:Labels[1]/ns0:DiscountAmtLbl[1]" w:storeItemID="{0E62280E-706F-45D7-BEE2-B24E4BE14C14}"/>
+              <w:dataBinding w:prefixMappings="xmlns:ns0='urn:microsoft-dynamics-nav/reports/Inventory_Customer_Sales/713/'" w:xpath="/ns0:NavWordReportXmlPart[1]/ns0:Labels[1]/ns0:DiscountAmtLbl[1]" w:storeItemID="{0E62280E-706F-45D7-BEE2-B24E4BE14C14}"/>
               <w:text/>
               <w:alias w:val="#Nav: /Labels/DiscountAmtLbl"/>
               <w:tag w:val="#Nav: FS_YSD_InventoryCustomerSales/50019"/>
@@ -323,7 +323,7 @@
             <w:placeholder>
               <w:docPart w:val="DefaultPlaceholder_-1854013440"/>
             </w:placeholder>
-            <w:dataBinding w:prefixMappings="xmlns:ns0='urn:microsoft-dynamics-nav/reports/FS_YSD_InventoryCustomerSales/50019/' " w:xpath="/ns0:NavWordReportXmlPart[1]/ns0:Labels[1]/ns0:ProfitLbl[1]" w:storeItemID="{0E62280E-706F-45D7-BEE2-B24E4BE14C14}"/>
+            <w:dataBinding w:prefixMappings="xmlns:ns0='urn:microsoft-dynamics-nav/reports/Inventory_Customer_Sales/713/'" w:xpath="/ns0:NavWordReportXmlPart[1]/ns0:Labels[1]/ns0:ProfitLbl[1]" w:storeItemID="{0E62280E-706F-45D7-BEE2-B24E4BE14C14}"/>
             <w:text/>
             <w:alias w:val="#Nav: /Labels/ProfitLbl"/>
             <w:tag w:val="#Nav: FS_YSD_InventoryCustomerSales/50019"/>
@@ -375,7 +375,7 @@
             <w:placeholder>
               <w:docPart w:val="DefaultPlaceholder_-1854013440"/>
             </w:placeholder>
-            <w:dataBinding w:prefixMappings="xmlns:ns0='urn:microsoft-dynamics-nav/reports/FS_YSD_InventoryCustomerSales/50019/' " w:xpath="/ns0:NavWordReportXmlPart[1]/ns0:Labels[1]/ns0:ProfitPctLbl[1]" w:storeItemID="{0E62280E-706F-45D7-BEE2-B24E4BE14C14}"/>
+            <w:dataBinding w:prefixMappings="xmlns:ns0='urn:microsoft-dynamics-nav/reports/Inventory_Customer_Sales/713/'" w:xpath="/ns0:NavWordReportXmlPart[1]/ns0:Labels[1]/ns0:ProfitPctLbl[1]" w:storeItemID="{0E62280E-706F-45D7-BEE2-B24E4BE14C14}"/>
             <w:text/>
             <w:alias w:val="#Nav: /Labels/ProfitPctLbl"/>
             <w:tag w:val="#Nav: FS_YSD_InventoryCustomerSales/50019"/>
@@ -576,7 +576,7 @@
           <w:alias w:val="#Nav: /Item"/>
           <w:tag w:val="#Nav: FS_YSD_InventoryCustomerSales/50019"/>
           <w:id w:val="37015946"/>
-          <w15:dataBinding w:prefixMappings="xmlns:ns0='urn:microsoft-dynamics-nav/reports/FS_YSD_InventoryCustomerSales/50019/' " w:xpath="/ns0:NavWordReportXmlPart[1]/ns0:Item" w:storeItemID="{0E62280E-706F-45D7-BEE2-B24E4BE14C14}"/>
+          <w15:dataBinding w:prefixMappings="xmlns:ns0='urn:microsoft-dynamics-nav/reports/Inventory_Customer_Sales/713/'" w:xpath="/ns0:NavWordReportXmlPart[1]/ns0:Item" w:storeItemID="{0E62280E-706F-45D7-BEE2-B24E4BE14C14}"/>
           <w15:repeatingSection/>
         </w:sdtPr>
         <w:sdtEndPr>
@@ -754,7 +754,7 @@
                     <w:placeholder>
                       <w:docPart w:val="DefaultPlaceholder_-1854013440"/>
                     </w:placeholder>
-                    <w15:dataBinding w:prefixMappings="xmlns:ns0='urn:microsoft-dynamics-nav/reports/FS_YSR_InventoryCustomerSales/50003/' " w:xpath="/ns0:NavWordReportXmlPart[1]/ns0:Item[1]/ns0:No_Item[1]" w:storeItemID="{17357049-351C-4FB5-BA49-88074E24903C}"/>
+                    <w15:dataBinding w:prefixMappings="xmlns:ns0='urn:microsoft-dynamics-nav/reports/Inventory_Customer_Sales/713/'" w:xpath="/ns0:NavWordReportXmlPart[1]/ns0:Item[1]/ns0:No_Item[1]" w:storeItemID="{17357049-351C-4FB5-BA49-88074E24903C}"/>
                   </w:sdtPr>
                   <w:sdtContent>
                     <w:tc>
@@ -798,7 +798,7 @@
                     <w:placeholder>
                       <w:docPart w:val="DefaultPlaceholder_-1854013440"/>
                     </w:placeholder>
-                    <w15:dataBinding w:prefixMappings="xmlns:ns0='urn:microsoft-dynamics-nav/reports/FS_YSR_InventoryCustomerSales/50003/' " w:xpath="/ns0:NavWordReportXmlPart[1]/ns0:Item[1]/ns0:Description_Item[1]" w:storeItemID="{17357049-351C-4FB5-BA49-88074E24903C}"/>
+                    <w15:dataBinding w:prefixMappings="xmlns:ns0='urn:microsoft-dynamics-nav/reports/Inventory_Customer_Sales/713/'" w:xpath="/ns0:NavWordReportXmlPart[1]/ns0:Item[1]/ns0:Description_Item[1]" w:storeItemID="{17357049-351C-4FB5-BA49-88074E24903C}"/>
                   </w:sdtPr>
                   <w:sdtContent>
                     <w:tc>
@@ -954,7 +954,7 @@
                     <w:placeholder>
                       <w:docPart w:val="DefaultPlaceholder_-1854013440"/>
                     </w:placeholder>
-                    <w:dataBinding w:prefixMappings="xmlns:ns0='urn:microsoft-dynamics-nav/reports/FS_YSD_InventoryCustomerSales/50019/'" w:xpath="/ns0:NavWordReportXmlPart[1]/ns0:Labels[1]/ns0:BaseUnitofMeasure_ItemCaption[1]" w:storeItemID="{0E62280E-706F-45D7-BEE2-B24E4BE14C14}"/>
+                    <w:dataBinding w:prefixMappings="xmlns:ns0='urn:microsoft-dynamics-nav/reports/Inventory_Customer_Sales/713/'" w:xpath="/ns0:NavWordReportXmlPart[1]/ns0:Labels[1]/ns0:BaseUnitofMeasure_ItemCaption[1]" w:storeItemID="{0E62280E-706F-45D7-BEE2-B24E4BE14C14}"/>
                     <w:text/>
                   </w:sdtPr>
                   <w:sdtContent>
@@ -997,7 +997,7 @@
                     <w:placeholder>
                       <w:docPart w:val="DefaultPlaceholder_-1854013440"/>
                     </w:placeholder>
-                    <w15:dataBinding w:prefixMappings="xmlns:ns0='urn:microsoft-dynamics-nav/reports/FS_YSR_InventoryCustomerSales/50003/' " w:xpath="/ns0:NavWordReportXmlPart[1]/ns0:Item[1]/ns0:BaseUnitofMeasure_Item[1]" w:storeItemID="{17357049-351C-4FB5-BA49-88074E24903C}"/>
+                    <w15:dataBinding w:prefixMappings="xmlns:ns0='urn:microsoft-dynamics-nav/reports/Inventory_Customer_Sales/713/'" w:xpath="/ns0:NavWordReportXmlPart[1]/ns0:Item[1]/ns0:BaseUnitofMeasure_Item[1]" w:storeItemID="{17357049-351C-4FB5-BA49-88074E24903C}"/>
                   </w:sdtPr>
                   <w:sdtContent>
                     <w:tc>
@@ -1115,7 +1115,7 @@
                   <w:alias w:val="#Nav: /Item/Item_Ledger_Entry"/>
                   <w:tag w:val="#Nav: FS_YSD_InventoryCustomerSales/50019"/>
                   <w:id w:val="100769726"/>
-                  <w15:dataBinding w:prefixMappings="xmlns:ns0='urn:microsoft-dynamics-nav/reports/FS_YSD_InventoryCustomerSales/50019/' " w:xpath="/ns0:NavWordReportXmlPart[1]/ns0:Item[1]/ns0:Item_Ledger_Entry" w:storeItemID="{0E62280E-706F-45D7-BEE2-B24E4BE14C14}"/>
+                  <w15:dataBinding w:prefixMappings="xmlns:ns0='urn:microsoft-dynamics-nav/reports/Inventory_Customer_Sales/713/'" w:xpath="/ns0:NavWordReportXmlPart[1]/ns0:Item[1]/ns0:Item_Ledger_Entry" w:storeItemID="{0E62280E-706F-45D7-BEE2-B24E4BE14C14}"/>
                   <w15:repeatingSection/>
                 </w:sdtPr>
                 <w:sdtEndPr>
@@ -1161,7 +1161,7 @@
                           <w:alias w:val="#Nav: /Item/Item_Ledger_Entry/Integer"/>
                           <w:tag w:val="#Nav: FS_YSD_InventoryCustomerSales/50019"/>
                           <w:id w:val="1092279626"/>
-                          <w15:dataBinding w:prefixMappings="xmlns:ns0='urn:microsoft-dynamics-nav/reports/FS_YSD_InventoryCustomerSales/50019/' " w:xpath="/ns0:NavWordReportXmlPart[1]/ns0:Item[1]/ns0:Item_Ledger_Entry[1]/ns0:Integer" w:storeItemID="{0E62280E-706F-45D7-BEE2-B24E4BE14C14}"/>
+                          <w15:dataBinding w:prefixMappings="xmlns:ns0='urn:microsoft-dynamics-nav/reports/Inventory_Customer_Sales/713/'" w:xpath="/ns0:NavWordReportXmlPart[1]/ns0:Item[1]/ns0:Item_Ledger_Entry[1]/ns0:Integer" w:storeItemID="{0E62280E-706F-45D7-BEE2-B24E4BE14C14}"/>
                           <w15:repeatingSection/>
                         </w:sdtPr>
                         <w:sdtEndPr>
@@ -1214,7 +1214,7 @@
                                     <w:placeholder>
                                       <w:docPart w:val="DefaultPlaceholder_-1854013440"/>
                                     </w:placeholder>
-                                    <w15:dataBinding w:prefixMappings="xmlns:ns0='urn:microsoft-dynamics-nav/reports/FS_YSR_InventoryCustomerSales/50003/' " w:xpath="/ns0:NavWordReportXmlPart[1]/ns0:Item[1]/ns0:Item_Ledger_Entry[1]/ns0:Integer[1]/ns0:SourceNo_ItemLedgEntry[1]" w:storeItemID="{17357049-351C-4FB5-BA49-88074E24903C}"/>
+                                    <w15:dataBinding w:prefixMappings="xmlns:ns0='urn:microsoft-dynamics-nav/reports/Inventory_Customer_Sales/713/'" w:xpath="/ns0:NavWordReportXmlPart[1]/ns0:Item[1]/ns0:Item_Ledger_Entry[1]/ns0:Integer[1]/ns0:SourceNo_ItemLedgEntry[1]" w:storeItemID="{17357049-351C-4FB5-BA49-88074E24903C}"/>
                                   </w:sdtPr>
                                   <w:sdtEndPr>
                                     <w:rPr>
@@ -1264,7 +1264,7 @@
                                     <w:placeholder>
                                       <w:docPart w:val="DefaultPlaceholder_-1854013440"/>
                                     </w:placeholder>
-                                    <w15:dataBinding w:prefixMappings="xmlns:ns0='urn:microsoft-dynamics-nav/reports/FS_YSR_InventoryCustomerSales/50003/' " w:xpath="/ns0:NavWordReportXmlPart[1]/ns0:Item[1]/ns0:Item_Ledger_Entry[1]/ns0:Integer[1]/ns0:CustName[1]" w:storeItemID="{17357049-351C-4FB5-BA49-88074E24903C}"/>
+                                    <w15:dataBinding w:prefixMappings="xmlns:ns0='urn:microsoft-dynamics-nav/reports/Inventory_Customer_Sales/713/'" w:xpath="/ns0:NavWordReportXmlPart[1]/ns0:Item[1]/ns0:Item_Ledger_Entry[1]/ns0:Integer[1]/ns0:CustName[1]" w:storeItemID="{17357049-351C-4FB5-BA49-88074E24903C}"/>
                                   </w:sdtPr>
                                   <w:sdtContent>
                                     <w:tc>
@@ -1322,7 +1322,7 @@
                                     <w:placeholder>
                                       <w:docPart w:val="DefaultPlaceholder_-1854013440"/>
                                     </w:placeholder>
-                                    <w15:dataBinding w:prefixMappings="xmlns:ns0='urn:microsoft-dynamics-nav/reports/FS_YSR_InventoryCustomerSales/50003/' " w:xpath="/ns0:NavWordReportXmlPart[1]/ns0:Item[1]/ns0:Item_Ledger_Entry[1]/ns0:Integer[1]/ns0:InvQty_ItemLedgEntry[1]" w:storeItemID="{17357049-351C-4FB5-BA49-88074E24903C}"/>
+                                    <w15:dataBinding w:prefixMappings="xmlns:ns0='urn:microsoft-dynamics-nav/reports/Inventory_Customer_Sales/713/'" w:xpath="/ns0:NavWordReportXmlPart[1]/ns0:Item[1]/ns0:Item_Ledger_Entry[1]/ns0:Integer[1]/ns0:InvQty_ItemLedgEntry[1]" w:storeItemID="{17357049-351C-4FB5-BA49-88074E24903C}"/>
                                   </w:sdtPr>
                                   <w:sdtContent>
                                     <w:tc>
@@ -1366,7 +1366,7 @@
                                     <w:placeholder>
                                       <w:docPart w:val="DefaultPlaceholder_-1854013440"/>
                                     </w:placeholder>
-                                    <w15:dataBinding w:prefixMappings="xmlns:ns0='urn:microsoft-dynamics-nav/reports/FS_YSR_InventoryCustomerSales/50003/' " w:xpath="/ns0:NavWordReportXmlPart[1]/ns0:Item[1]/ns0:Item_Ledger_Entry[1]/ns0:Integer[1]/ns0:SalesAmtActual_ItemLedgEntry[1]" w:storeItemID="{17357049-351C-4FB5-BA49-88074E24903C}"/>
+                                    <w15:dataBinding w:prefixMappings="xmlns:ns0='urn:microsoft-dynamics-nav/reports/Inventory_Customer_Sales/713/'" w:xpath="/ns0:NavWordReportXmlPart[1]/ns0:Item[1]/ns0:Item_Ledger_Entry[1]/ns0:Integer[1]/ns0:SalesAmtActual_ItemLedgEntry[1]" w:storeItemID="{17357049-351C-4FB5-BA49-88074E24903C}"/>
                                   </w:sdtPr>
                                   <w:sdtContent>
                                     <w:tc>
@@ -1410,7 +1410,7 @@
                                     <w:placeholder>
                                       <w:docPart w:val="DefaultPlaceholder_-1854013440"/>
                                     </w:placeholder>
-                                    <w15:dataBinding w:prefixMappings="xmlns:ns0='urn:microsoft-dynamics-nav/reports/FS_YSR_InventoryCustomerSales/50003/' " w:xpath="/ns0:NavWordReportXmlPart[1]/ns0:Item[1]/ns0:Item_Ledger_Entry[1]/ns0:Integer[1]/ns0:DiscountAmount[1]" w:storeItemID="{17357049-351C-4FB5-BA49-88074E24903C}"/>
+                                    <w15:dataBinding w:prefixMappings="xmlns:ns0='urn:microsoft-dynamics-nav/reports/Inventory_Customer_Sales/713/'" w:xpath="/ns0:NavWordReportXmlPart[1]/ns0:Item[1]/ns0:Item_Ledger_Entry[1]/ns0:Integer[1]/ns0:DiscountAmount[1]" w:storeItemID="{17357049-351C-4FB5-BA49-88074E24903C}"/>
                                   </w:sdtPr>
                                   <w:sdtContent>
                                     <w:tc>
@@ -1454,7 +1454,7 @@
                                     <w:placeholder>
                                       <w:docPart w:val="DefaultPlaceholder_-1854013440"/>
                                     </w:placeholder>
-                                    <w15:dataBinding w:prefixMappings="xmlns:ns0='urn:microsoft-dynamics-nav/reports/FS_YSR_InventoryCustomerSales/50003/' " w:xpath="/ns0:NavWordReportXmlPart[1]/ns0:Item[1]/ns0:Item_Ledger_Entry[1]/ns0:Integer[1]/ns0:Profit_ItemLedgEntry[1]" w:storeItemID="{17357049-351C-4FB5-BA49-88074E24903C}"/>
+                                    <w15:dataBinding w:prefixMappings="xmlns:ns0='urn:microsoft-dynamics-nav/reports/Inventory_Customer_Sales/713/'" w:xpath="/ns0:NavWordReportXmlPart[1]/ns0:Item[1]/ns0:Item_Ledger_Entry[1]/ns0:Integer[1]/ns0:Profit_ItemLedgEntry[1]" w:storeItemID="{17357049-351C-4FB5-BA49-88074E24903C}"/>
                                   </w:sdtPr>
                                   <w:sdtContent>
                                     <w:tc>
@@ -1498,7 +1498,7 @@
                                     <w:placeholder>
                                       <w:docPart w:val="DefaultPlaceholder_-1854013440"/>
                                     </w:placeholder>
-                                    <w15:dataBinding w:prefixMappings="xmlns:ns0='urn:microsoft-dynamics-nav/reports/FS_YSR_InventoryCustomerSales/50003/' " w:xpath="/ns0:NavWordReportXmlPart[1]/ns0:Item[1]/ns0:Item_Ledger_Entry[1]/ns0:Integer[1]/ns0:ProfitPct_ItemLedgEntry[1]" w:storeItemID="{17357049-351C-4FB5-BA49-88074E24903C}"/>
+                                    <w15:dataBinding w:prefixMappings="xmlns:ns0='urn:microsoft-dynamics-nav/reports/Inventory_Customer_Sales/713/'" w:xpath="/ns0:NavWordReportXmlPart[1]/ns0:Item[1]/ns0:Item_Ledger_Entry[1]/ns0:Integer[1]/ns0:ProfitPct_ItemLedgEntry[1]" w:storeItemID="{17357049-351C-4FB5-BA49-88074E24903C}"/>
                                   </w:sdtPr>
                                   <w:sdtContent>
                                     <w:tc>
@@ -1574,7 +1574,7 @@
                     <w:placeholder>
                       <w:docPart w:val="DefaultPlaceholder_-1854013440"/>
                     </w:placeholder>
-                    <w15:dataBinding w:prefixMappings="xmlns:ns0='urn:microsoft-dynamics-nav/reports/FS_YSR_InventoryCustomerSales/50003/' " w:xpath="/ns0:NavWordReportXmlPart[1]/ns0:Item[1]/ns0:SubTotals[1]/ns0:SubTotals_Description[1]" w:storeItemID="{17357049-351C-4FB5-BA49-88074E24903C}"/>
+                    <w15:dataBinding w:prefixMappings="xmlns:ns0='urn:microsoft-dynamics-nav/reports/Inventory_Customer_Sales/713/'" w:xpath="/ns0:NavWordReportXmlPart[1]/ns0:Item[1]/ns0:SubTotals[1]/ns0:SubTotals_Description[1]" w:storeItemID="{17357049-351C-4FB5-BA49-88074E24903C}"/>
                   </w:sdtPr>
                   <w:sdtContent>
                     <w:tc>
@@ -1638,7 +1638,7 @@
                     <w:placeholder>
                       <w:docPart w:val="DefaultPlaceholder_-1854013440"/>
                     </w:placeholder>
-                    <w15:dataBinding w:prefixMappings="xmlns:ns0='urn:microsoft-dynamics-nav/reports/FS_YSR_InventoryCustomerSales/50003/' " w:xpath="/ns0:NavWordReportXmlPart[1]/ns0:Item[1]/ns0:SubTotals[1]/ns0:SubTotals_InvQty[1]" w:storeItemID="{17357049-351C-4FB5-BA49-88074E24903C}"/>
+                    <w15:dataBinding w:prefixMappings="xmlns:ns0='urn:microsoft-dynamics-nav/reports/Inventory_Customer_Sales/713/'" w:xpath="/ns0:NavWordReportXmlPart[1]/ns0:Item[1]/ns0:SubTotals[1]/ns0:SubTotals_InvQty[1]" w:storeItemID="{17357049-351C-4FB5-BA49-88074E24903C}"/>
                   </w:sdtPr>
                   <w:sdtContent>
                     <w:tc>
@@ -1687,7 +1687,7 @@
                     <w:placeholder>
                       <w:docPart w:val="DefaultPlaceholder_-1854013440"/>
                     </w:placeholder>
-                    <w15:dataBinding w:prefixMappings="xmlns:ns0='urn:microsoft-dynamics-nav/reports/FS_YSR_InventoryCustomerSales/50003/' " w:xpath="/ns0:NavWordReportXmlPart[1]/ns0:Item[1]/ns0:SubTotals[1]/ns0:SubTotals_SalesAmtActual[1]" w:storeItemID="{17357049-351C-4FB5-BA49-88074E24903C}"/>
+                    <w15:dataBinding w:prefixMappings="xmlns:ns0='urn:microsoft-dynamics-nav/reports/Inventory_Customer_Sales/713/'" w:xpath="/ns0:NavWordReportXmlPart[1]/ns0:Item[1]/ns0:SubTotals[1]/ns0:SubTotals_SalesAmtActual[1]" w:storeItemID="{17357049-351C-4FB5-BA49-88074E24903C}"/>
                   </w:sdtPr>
                   <w:sdtContent>
                     <w:tc>
@@ -1736,7 +1736,7 @@
                     <w:placeholder>
                       <w:docPart w:val="DefaultPlaceholder_-1854013440"/>
                     </w:placeholder>
-                    <w15:dataBinding w:prefixMappings="xmlns:ns0='urn:microsoft-dynamics-nav/reports/FS_YSR_InventoryCustomerSales/50003/' " w:xpath="/ns0:NavWordReportXmlPart[1]/ns0:Item[1]/ns0:SubTotals[1]/ns0:SubTotals_DiscountAmount[1]" w:storeItemID="{17357049-351C-4FB5-BA49-88074E24903C}"/>
+                    <w15:dataBinding w:prefixMappings="xmlns:ns0='urn:microsoft-dynamics-nav/reports/Inventory_Customer_Sales/713/'" w:xpath="/ns0:NavWordReportXmlPart[1]/ns0:Item[1]/ns0:SubTotals[1]/ns0:SubTotals_DiscountAmount[1]" w:storeItemID="{17357049-351C-4FB5-BA49-88074E24903C}"/>
                   </w:sdtPr>
                   <w:sdtContent>
                     <w:tc>
@@ -1785,7 +1785,7 @@
                     <w:placeholder>
                       <w:docPart w:val="DefaultPlaceholder_-1854013440"/>
                     </w:placeholder>
-                    <w15:dataBinding w:prefixMappings="xmlns:ns0='urn:microsoft-dynamics-nav/reports/FS_YSR_InventoryCustomerSales/50003/' " w:xpath="/ns0:NavWordReportXmlPart[1]/ns0:Item[1]/ns0:SubTotals[1]/ns0:SubTotals_Profit[1]" w:storeItemID="{17357049-351C-4FB5-BA49-88074E24903C}"/>
+                    <w15:dataBinding w:prefixMappings="xmlns:ns0='urn:microsoft-dynamics-nav/reports/Inventory_Customer_Sales/713/'" w:xpath="/ns0:NavWordReportXmlPart[1]/ns0:Item[1]/ns0:SubTotals[1]/ns0:SubTotals_Profit[1]" w:storeItemID="{17357049-351C-4FB5-BA49-88074E24903C}"/>
                   </w:sdtPr>
                   <w:sdtContent>
                     <w:tc>
@@ -1832,7 +1832,7 @@
                     <w:placeholder>
                       <w:docPart w:val="DefaultPlaceholder_-1854013440"/>
                     </w:placeholder>
-                    <w15:dataBinding w:prefixMappings="xmlns:ns0='urn:microsoft-dynamics-nav/reports/FS_YSR_InventoryCustomerSales/50003/' " w:xpath="/ns0:NavWordReportXmlPart[1]/ns0:Item[1]/ns0:SubTotals[1]/ns0:SubTotals_ProfitPct[1]" w:storeItemID="{17357049-351C-4FB5-BA49-88074E24903C}"/>
+                    <w15:dataBinding w:prefixMappings="xmlns:ns0='urn:microsoft-dynamics-nav/reports/Inventory_Customer_Sales/713/'" w:xpath="/ns0:NavWordReportXmlPart[1]/ns0:Item[1]/ns0:SubTotals[1]/ns0:SubTotals_ProfitPct[1]" w:storeItemID="{17357049-351C-4FB5-BA49-88074E24903C}"/>
                   </w:sdtPr>
                   <w:sdtContent>
                     <w:tc>
@@ -2131,7 +2131,7 @@
             <w:placeholder>
               <w:docPart w:val="DefaultPlaceholder_-1854013440"/>
             </w:placeholder>
-            <w:dataBinding w:prefixMappings="xmlns:ns0='urn:microsoft-dynamics-nav/reports/FS_YSD_InventoryCustomerSales/50019/'" w:xpath="/ns0:NavWordReportXmlPart[1]/ns0:Totals[1]/ns0:Totals_SalesAmtActual[1]" w:storeItemID="{0E62280E-706F-45D7-BEE2-B24E4BE14C14}"/>
+            <w:dataBinding w:prefixMappings="xmlns:ns0='urn:microsoft-dynamics-nav/reports/Inventory_Customer_Sales/713/'" w:xpath="/ns0:NavWordReportXmlPart[1]/ns0:Totals[1]/ns0:Totals_SalesAmtActual[1]" w:storeItemID="{0E62280E-706F-45D7-BEE2-B24E4BE14C14}"/>
             <w:text/>
           </w:sdtPr>
           <w:sdtContent>
@@ -2185,7 +2185,7 @@
             <w:placeholder>
               <w:docPart w:val="DefaultPlaceholder_-1854013440"/>
             </w:placeholder>
-            <w:dataBinding w:prefixMappings="xmlns:ns0='urn:microsoft-dynamics-nav/reports/FS_YSD_InventoryCustomerSales/50019/'" w:xpath="/ns0:NavWordReportXmlPart[1]/ns0:Totals[1]/ns0:Totals_DiscountAmount[1]" w:storeItemID="{0E62280E-706F-45D7-BEE2-B24E4BE14C14}"/>
+            <w:dataBinding w:prefixMappings="xmlns:ns0='urn:microsoft-dynamics-nav/reports/Inventory_Customer_Sales/713/'" w:xpath="/ns0:NavWordReportXmlPart[1]/ns0:Totals[1]/ns0:Totals_DiscountAmount[1]" w:storeItemID="{0E62280E-706F-45D7-BEE2-B24E4BE14C14}"/>
             <w:text/>
           </w:sdtPr>
           <w:sdtContent>
@@ -2239,7 +2239,7 @@
             <w:placeholder>
               <w:docPart w:val="DefaultPlaceholder_-1854013440"/>
             </w:placeholder>
-            <w:dataBinding w:prefixMappings="xmlns:ns0='urn:microsoft-dynamics-nav/reports/FS_YSD_InventoryCustomerSales/50019/'" w:xpath="/ns0:NavWordReportXmlPart[1]/ns0:Totals[1]/ns0:Totals_Profit[1]" w:storeItemID="{0E62280E-706F-45D7-BEE2-B24E4BE14C14}"/>
+            <w:dataBinding w:prefixMappings="xmlns:ns0='urn:microsoft-dynamics-nav/reports/Inventory_Customer_Sales/713/'" w:xpath="/ns0:NavWordReportXmlPart[1]/ns0:Totals[1]/ns0:Totals_Profit[1]" w:storeItemID="{0E62280E-706F-45D7-BEE2-B24E4BE14C14}"/>
             <w:text/>
           </w:sdtPr>
           <w:sdtContent>
@@ -2293,7 +2293,7 @@
             <w:placeholder>
               <w:docPart w:val="DefaultPlaceholder_-1854013440"/>
             </w:placeholder>
-            <w:dataBinding w:prefixMappings="xmlns:ns0='urn:microsoft-dynamics-nav/reports/FS_YSD_InventoryCustomerSales/50019/'" w:xpath="/ns0:NavWordReportXmlPart[1]/ns0:Totals[1]/ns0:Totals_ProfitPct[1]" w:storeItemID="{0E62280E-706F-45D7-BEE2-B24E4BE14C14}"/>
+            <w:dataBinding w:prefixMappings="xmlns:ns0='urn:microsoft-dynamics-nav/reports/Inventory_Customer_Sales/713/'" w:xpath="/ns0:NavWordReportXmlPart[1]/ns0:Totals[1]/ns0:Totals_ProfitPct[1]" w:storeItemID="{0E62280E-706F-45D7-BEE2-B24E4BE14C14}"/>
             <w:text/>
           </w:sdtPr>
           <w:sdtContent>
@@ -2483,7 +2483,7 @@
           <w:placeholder>
             <w:docPart w:val="DefaultPlaceholder_-1854013440"/>
           </w:placeholder>
-          <w:dataBinding w:prefixMappings="xmlns:ns0='urn:microsoft-dynamics-nav/reports/FS_YSD_InventoryCustomerSales/50019/' " w:xpath="/ns0:NavWordReportXmlPart[1]/ns0:Labels[1]/ns0:InventoryCustomerSalesLbl[1]" w:storeItemID="{0E62280E-706F-45D7-BEE2-B24E4BE14C14}"/>
+          <w:dataBinding w:prefixMappings="xmlns:ns0='urn:microsoft-dynamics-nav/reports/Inventory_Customer_Sales/713/'" w:xpath="/ns0:NavWordReportXmlPart[1]/ns0:Labels[1]/ns0:InventoryCustomerSalesLbl[1]" w:storeItemID="{0E62280E-706F-45D7-BEE2-B24E4BE14C14}"/>
           <w:text/>
         </w:sdtPr>
         <w:sdtContent>
@@ -2706,7 +2706,7 @@
               <w:placeholder>
                 <w:docPart w:val="66E472B77CED4562AC3C88900F76E129"/>
               </w:placeholder>
-              <w:dataBinding w:prefixMappings="xmlns:ns0='urn:microsoft-dynamics-nav/reports/FS_YSD_InventoryCustomerSales/50019/'" w:xpath="/ns0:NavWordReportXmlPart[1]/ns0:BCReportInformation[1]/ns0:ReportRequest[1]/ns0:UserName[1]" w:storeItemID="{0E62280E-706F-45D7-BEE2-B24E4BE14C14}"/>
+              <w:dataBinding w:prefixMappings="xmlns:ns0='urn:microsoft-dynamics-nav/reports/Inventory_Customer_Sales/713/'" w:xpath="/ns0:NavWordReportXmlPart[1]/ns0:BCReportInformation[1]/ns0:ReportRequest[1]/ns0:UserName[1]" w:storeItemID="{0E62280E-706F-45D7-BEE2-B24E4BE14C14}"/>
               <w:text/>
             </w:sdtPr>
             <w:sdtContent>
@@ -2754,7 +2754,7 @@
             <w:placeholder>
               <w:docPart w:val="C094C4BF41804FD1B5E0F604A4595C5E"/>
             </w:placeholder>
-            <w:dataBinding w:prefixMappings="xmlns:ns0='urn:microsoft-dynamics-nav/reports/FS_YSD_InventoryCustomerSales/50019/'" w:xpath="/ns0:NavWordReportXmlPart[1]/ns0:BCReportInformation[1]/ns0:ReportRequest[1]/ns0:CompanyName[1]" w:storeItemID="{0E62280E-706F-45D7-BEE2-B24E4BE14C14}"/>
+            <w:dataBinding w:prefixMappings="xmlns:ns0='urn:microsoft-dynamics-nav/reports/Inventory_Customer_Sales/713/'" w:xpath="/ns0:NavWordReportXmlPart[1]/ns0:BCReportInformation[1]/ns0:ReportRequest[1]/ns0:CompanyName[1]" w:storeItemID="{0E62280E-706F-45D7-BEE2-B24E4BE14C14}"/>
             <w:text/>
           </w:sdtPr>
           <w:sdtContent>
@@ -2831,7 +2831,7 @@
               <w:placeholder>
                 <w:docPart w:val="DefaultPlaceholder_-1854013440"/>
               </w:placeholder>
-              <w:dataBinding w:prefixMappings="xmlns:ns0='urn:microsoft-dynamics-nav/reports/FS_YSD_InventoryCustomerSales/50019/' " w:xpath="/ns0:NavWordReportXmlPart[1]/ns0:ReportHeader[1]/ns0:ItemFilter[1]" w:storeItemID="{0E62280E-706F-45D7-BEE2-B24E4BE14C14}"/>
+              <w:dataBinding w:prefixMappings="xmlns:ns0='urn:microsoft-dynamics-nav/reports/Inventory_Customer_Sales/713/'" w:xpath="/ns0:NavWordReportXmlPart[1]/ns0:ReportHeader[1]/ns0:ItemFilter[1]" w:storeItemID="{0E62280E-706F-45D7-BEE2-B24E4BE14C14}"/>
               <w:text/>
             </w:sdtPr>
             <w:sdtContent>
@@ -2890,7 +2890,7 @@
               <w:placeholder>
                 <w:docPart w:val="DefaultPlaceholder_-1854013440"/>
               </w:placeholder>
-              <w:dataBinding w:prefixMappings="xmlns:ns0='urn:microsoft-dynamics-nav/reports/FS_YSD_InventoryCustomerSales/50019/' " w:xpath="/ns0:NavWordReportXmlPart[1]/ns0:ReportHeader[1]/ns0:ItemLedgEntryFilter[1]" w:storeItemID="{0E62280E-706F-45D7-BEE2-B24E4BE14C14}"/>
+              <w:dataBinding w:prefixMappings="xmlns:ns0='urn:microsoft-dynamics-nav/reports/Inventory_Customer_Sales/713/'" w:xpath="/ns0:NavWordReportXmlPart[1]/ns0:ReportHeader[1]/ns0:ItemLedgEntryFilter[1]" w:storeItemID="{0E62280E-706F-45D7-BEE2-B24E4BE14C14}"/>
               <w:text/>
             </w:sdtPr>
             <w:sdtContent>
@@ -4615,7 +4615,7 @@
 
 <file path=customXml/item1.xml>��< ? x m l   v e r s i o n = " 1 . 0 "   e n c o d i n g = " u t f - 1 6 " ? >   
- < N a v W o r d R e p o r t X m l P a r t   x m l n s = " u r n : m i c r o s o f t - d y n a m i c s - n a v / r e p o r t s / F S _ Y S D _ I n v e n t o r y C u s t o m e r S a l e s / 5 0 0 1 9 / " > + < N a v W o r d R e p o r t X m l P a r t   x m l n s = " u r n : m i c r o s o f t - d y n a m i c s - n a v / r e p o r t s / I n v e n t o r y _ C u s t o m e r _ S a l e s / 7 1 3 / " >   
      < B C R e p o r t I n f o r m a t i o n >   

</xml_diff>